<commit_message>
Expand German glossary and update docx
Extend Glossar.md with additional English→German mappings (e.g. Stat → Attribut/Wert, Pool, Edge, Might/Kraft, Speed/Reflex, Intellect/Intellekt, Inability, Trained, Specialized, wound severity terms, Game Master, Tier, hindered/eased, Asset, etc.) and adjust ordering. Also update the binary de/01_Der Kerncharakter.docx file (content changed).
</commit_message>
<xml_diff>
--- a/de/01_Der Kerncharakter.docx
+++ b/de/01_Der Kerncharakter.docx
@@ -23,7 +23,191 @@
         <w:rPr>
           <w:lang w:val="de-DE"/>
         </w:rPr>
-        <w:t>Ein Cypher-Charakter wird durch einen beschreibenden Satz definiert, wie ein charmanter Zauberer, der auf dem Blitz reitet, oder ein schleichender Techniker, der mit Maschinen spricht. Aber bevor du dir die Teile dieses Satzes ansiehst, beginnst du mit dem Kern eines Charakters, der dir deine Grundwerte, ein paar Fähigkeiten und ein paar andere Spielelemente gibt, die jeder Charakter braucht (wie viele Wunden du ertragen kannst). Ein Kerncharakter ist ein völlig spielbarer (wenn auch etwas uninteressanter) Charakter. Als Kerncharakter weißt du, wie man gewöhnliche Aktionen ausführt und mit der Welt interagiert, die der Spielleiter präsentiert.</w:t>
+        <w:t xml:space="preserve">Ein Cypher-Charakter wird durch einen beschreibenden Satz definiert, wie </w:t>
+      </w:r>
+      <w:r>
+        <w:rPr>
+          <w:i/>
+          <w:iCs/>
+          <w:lang w:val="de-DE"/>
+        </w:rPr>
+        <w:t xml:space="preserve">ein </w:t>
+      </w:r>
+      <w:r>
+        <w:rPr>
+          <w:i/>
+          <w:iCs/>
+          <w:lang w:val="de-DE"/>
+        </w:rPr>
+        <w:t>C</w:t>
+      </w:r>
+      <w:r>
+        <w:rPr>
+          <w:i/>
+          <w:iCs/>
+          <w:lang w:val="de-DE"/>
+        </w:rPr>
+        <w:t xml:space="preserve">harmanter Zauberer, der auf </w:t>
+      </w:r>
+      <w:r>
+        <w:rPr>
+          <w:i/>
+          <w:iCs/>
+          <w:lang w:val="de-DE"/>
+        </w:rPr>
+        <w:t>einem</w:t>
+      </w:r>
+      <w:r>
+        <w:rPr>
+          <w:i/>
+          <w:iCs/>
+          <w:lang w:val="de-DE"/>
+        </w:rPr>
+        <w:t xml:space="preserve"> Blitz reitet</w:t>
+      </w:r>
+      <w:r>
+        <w:rPr>
+          <w:lang w:val="de-DE"/>
+        </w:rPr>
+        <w:t xml:space="preserve">, oder </w:t>
+      </w:r>
+      <w:r>
+        <w:rPr>
+          <w:i/>
+          <w:iCs/>
+          <w:lang w:val="de-DE"/>
+        </w:rPr>
+        <w:t>ein</w:t>
+      </w:r>
+      <w:r>
+        <w:rPr>
+          <w:i/>
+          <w:iCs/>
+          <w:lang w:val="de-DE"/>
+        </w:rPr>
+        <w:t>e</w:t>
+      </w:r>
+      <w:r>
+        <w:rPr>
+          <w:i/>
+          <w:iCs/>
+          <w:lang w:val="de-DE"/>
+        </w:rPr>
+        <w:t xml:space="preserve"> </w:t>
+      </w:r>
+      <w:r>
+        <w:rPr>
+          <w:i/>
+          <w:iCs/>
+          <w:lang w:val="de-DE"/>
+        </w:rPr>
+        <w:t>Heimlichee</w:t>
+      </w:r>
+      <w:r>
+        <w:rPr>
+          <w:i/>
+          <w:iCs/>
+          <w:lang w:val="de-DE"/>
+        </w:rPr>
+        <w:t xml:space="preserve"> Techniker</w:t>
+      </w:r>
+      <w:r>
+        <w:rPr>
+          <w:i/>
+          <w:iCs/>
+          <w:lang w:val="de-DE"/>
+        </w:rPr>
+        <w:t>in</w:t>
+      </w:r>
+      <w:r>
+        <w:rPr>
+          <w:i/>
+          <w:iCs/>
+          <w:lang w:val="de-DE"/>
+        </w:rPr>
+        <w:t xml:space="preserve">, </w:t>
+      </w:r>
+      <w:r>
+        <w:rPr>
+          <w:i/>
+          <w:iCs/>
+          <w:lang w:val="de-DE"/>
+        </w:rPr>
+        <w:t>die</w:t>
+      </w:r>
+      <w:r>
+        <w:rPr>
+          <w:i/>
+          <w:iCs/>
+          <w:lang w:val="de-DE"/>
+        </w:rPr>
+        <w:t xml:space="preserve"> mit Maschinen spricht.</w:t>
+      </w:r>
+      <w:r>
+        <w:rPr>
+          <w:lang w:val="de-DE"/>
+        </w:rPr>
+        <w:t xml:space="preserve"> Aber bevor du dir die Teile dieses Satzes ansiehst, beginnst du mit dem Kern eines Charakters, der dir deine Grundwerte, ein paar </w:t>
+      </w:r>
+      <w:r>
+        <w:rPr>
+          <w:lang w:val="de-DE"/>
+        </w:rPr>
+        <w:t>Fertigkeiten</w:t>
+      </w:r>
+      <w:r>
+        <w:rPr>
+          <w:lang w:val="de-DE"/>
+        </w:rPr>
+        <w:t xml:space="preserve"> und ein paar andere Spielelemente gibt, die jeder Charakter braucht (</w:t>
+      </w:r>
+      <w:r>
+        <w:rPr>
+          <w:lang w:val="de-DE"/>
+        </w:rPr>
+        <w:t>z.B. </w:t>
+      </w:r>
+      <w:r>
+        <w:rPr>
+          <w:lang w:val="de-DE"/>
+        </w:rPr>
+        <w:t xml:space="preserve">wie viele Wunden du </w:t>
+      </w:r>
+      <w:r>
+        <w:rPr>
+          <w:lang w:val="de-DE"/>
+        </w:rPr>
+        <w:t>erleiden</w:t>
+      </w:r>
+      <w:r>
+        <w:rPr>
+          <w:lang w:val="de-DE"/>
+        </w:rPr>
+        <w:t xml:space="preserve"> kannst). Ein Kerncharakter ist ein völlig spielbarer (wenn auch etwas uninteressanter) Charakter. Als Kerncharakter weißt du, wie man gewöhnliche Aktionen ausführt und mit der Welt interagiert, die </w:t>
+      </w:r>
+      <w:r>
+        <w:rPr>
+          <w:lang w:val="de-DE"/>
+        </w:rPr>
+        <w:t>die</w:t>
+      </w:r>
+      <w:r>
+        <w:rPr>
+          <w:lang w:val="de-DE"/>
+        </w:rPr>
+        <w:t xml:space="preserve"> Spielleit</w:t>
+      </w:r>
+      <w:r>
+        <w:rPr>
+          <w:lang w:val="de-DE"/>
+        </w:rPr>
+        <w:t>ung</w:t>
+      </w:r>
+      <w:r>
+        <w:rPr>
+          <w:lang w:val="de-DE"/>
+        </w:rPr>
+        <w:t xml:space="preserve"> präsentiert.</w:t>
       </w:r>
     </w:p>
     <w:p>
@@ -34,7 +218,7 @@
       <w:bookmarkEnd w:id="0"/>
       <w:bookmarkEnd w:id="1"/>
       <w:r>
-        <w:t>Tier</w:t>
+        <w:t>Rang</w:t>
       </w:r>
     </w:p>
     <w:p>
@@ -48,7 +232,49 @@
         <w:rPr>
           <w:lang w:val="de-DE"/>
         </w:rPr>
-        <w:t>Tier ist ein Maß für deine gesammelte Erfahrung. Ein Kerncharakter beginnt auf Stufe 1. Ein Tier-1-Charakter ist mehr als nur ein Anfänger; Du bist einigermaßen erfolgreich und fähig, auf einer Stufe mit einem Studenten oder einer Person in einem typischen Job, der Erfahrung oder Ausbildung erfordert.</w:t>
+        <w:t>Dein Rang</w:t>
+      </w:r>
+      <w:r>
+        <w:rPr>
+          <w:lang w:val="de-DE"/>
+        </w:rPr>
+        <w:t xml:space="preserve"> ist ein Maß für deine gesammelte Erfahrung. Ein Kerncharakter beginnt auf </w:t>
+      </w:r>
+      <w:r>
+        <w:rPr>
+          <w:lang w:val="de-DE"/>
+        </w:rPr>
+        <w:t>Rang</w:t>
+      </w:r>
+      <w:r>
+        <w:rPr>
+          <w:lang w:val="de-DE"/>
+        </w:rPr>
+        <w:t xml:space="preserve"> 1. Ein </w:t>
+      </w:r>
+      <w:r>
+        <w:rPr>
+          <w:lang w:val="de-DE"/>
+        </w:rPr>
+        <w:t>Rang</w:t>
+      </w:r>
+      <w:r>
+        <w:rPr>
+          <w:lang w:val="de-DE"/>
+        </w:rPr>
+        <w:t xml:space="preserve">-1-Charakter ist mehr als nur ein Anfänger; </w:t>
+      </w:r>
+      <w:r>
+        <w:rPr>
+          <w:lang w:val="de-DE"/>
+        </w:rPr>
+        <w:t>d</w:t>
+      </w:r>
+      <w:r>
+        <w:rPr>
+          <w:lang w:val="de-DE"/>
+        </w:rPr>
+        <w:t>u bist einigermaßen erfolgreich und fähig, auf einer Stufe mit einem Studenten oder einer Person in einem typischen Job, der Erfahrung oder Ausbildung erfordert.</w:t>
       </w:r>
     </w:p>
     <w:p>
@@ -62,7 +288,55 @@
         <w:rPr>
           <w:lang w:val="de-DE"/>
         </w:rPr>
-        <w:t>Im Verlauf des Spiels, während du reist, Dinge erlebst und Ziele erreichst, steigst du auf höhere Stufen auf und schaltest neue Fähigkeiten frei. Sehr erfahrene Charaktere erreichen Tier 6 und vielleicht sogar höher. Ein Charakter der Stufe 6 kann viel mehr erreichen als ein Charakter der Stufe 1.</w:t>
+        <w:t xml:space="preserve">Im Verlauf des Spiels, während du reist, Dinge erlebst und Ziele erreichst, steigst du auf höhere </w:t>
+      </w:r>
+      <w:r>
+        <w:rPr>
+          <w:lang w:val="de-DE"/>
+        </w:rPr>
+        <w:t>Ränge</w:t>
+      </w:r>
+      <w:r>
+        <w:rPr>
+          <w:lang w:val="de-DE"/>
+        </w:rPr>
+        <w:t xml:space="preserve"> auf und schaltest neue Fähigkeiten frei. Sehr erfahrene Charaktere erreichen </w:t>
+      </w:r>
+      <w:r>
+        <w:rPr>
+          <w:lang w:val="de-DE"/>
+        </w:rPr>
+        <w:t>Rang</w:t>
+      </w:r>
+      <w:r>
+        <w:rPr>
+          <w:lang w:val="de-DE"/>
+        </w:rPr>
+        <w:t xml:space="preserve"> 6 und vielleicht sogar höher. Ein Charakter </w:t>
+      </w:r>
+      <w:r>
+        <w:rPr>
+          <w:lang w:val="de-DE"/>
+        </w:rPr>
+        <w:t>des Rangs</w:t>
+      </w:r>
+      <w:r>
+        <w:rPr>
+          <w:lang w:val="de-DE"/>
+        </w:rPr>
+        <w:t xml:space="preserve"> 6 kann viel mehr erreichen als ein Charakter de</w:t>
+      </w:r>
+      <w:r>
+        <w:rPr>
+          <w:lang w:val="de-DE"/>
+        </w:rPr>
+        <w:t xml:space="preserve">s Rangs </w:t>
+      </w:r>
+      <w:r>
+        <w:rPr>
+          <w:lang w:val="de-DE"/>
+        </w:rPr>
+        <w:t>1.</w:t>
       </w:r>
     </w:p>
     <w:p>
@@ -72,7 +346,10 @@
       <w:bookmarkStart w:id="3" w:name="your-three-stats"/>
       <w:bookmarkEnd w:id="2"/>
       <w:r>
-        <w:t>Deine drei Werte</w:t>
+        <w:t xml:space="preserve">Deine drei </w:t>
+      </w:r>
+      <w:r>
+        <w:t>Attribute</w:t>
       </w:r>
     </w:p>
     <w:p>
@@ -86,7 +363,31 @@
         <w:rPr>
           <w:lang w:val="de-DE"/>
         </w:rPr>
-        <w:t xml:space="preserve">Dein Charakter hat drei definierende Merkmale, die typischerweise als Statistiken oder "Status" bezeichnet werden. Diese Werte sind </w:t>
+        <w:t xml:space="preserve">Dein Charakter hat drei definierende Merkmale, die typischerweise als </w:t>
+      </w:r>
+      <w:r>
+        <w:rPr>
+          <w:lang w:val="de-DE"/>
+        </w:rPr>
+        <w:t>„Attribute“</w:t>
+      </w:r>
+      <w:r>
+        <w:rPr>
+          <w:lang w:val="de-DE"/>
+        </w:rPr>
+        <w:t xml:space="preserve"> oder </w:t>
+      </w:r>
+      <w:r>
+        <w:rPr>
+          <w:lang w:val="de-DE"/>
+        </w:rPr>
+        <w:t>„Wert“</w:t>
+      </w:r>
+      <w:r>
+        <w:rPr>
+          <w:lang w:val="de-DE"/>
+        </w:rPr>
+        <w:t xml:space="preserve"> bezeichnet werden. Diese Werte sind </w:t>
       </w:r>
       <w:r>
         <w:rPr>
@@ -108,7 +409,7 @@
           <w:bCs/>
           <w:lang w:val="de-DE"/>
         </w:rPr>
-        <w:t>Geschwindigkeit</w:t>
+        <w:t>Reflex</w:t>
       </w:r>
       <w:r>
         <w:rPr>
@@ -128,21 +429,103 @@
         <w:rPr>
           <w:lang w:val="de-DE"/>
         </w:rPr>
-        <w:t xml:space="preserve">. Jeder der drei Werte besteht aus zwei Komponenten: Pool und Edge, also gibt es einen Might Pool und Might Edge, einen Speed Pool und Speed Edge sowie einen </w:t>
-      </w:r>
-      <w:proofErr w:type="spellStart"/>
-      <w:r>
-        <w:rPr>
-          <w:lang w:val="de-DE"/>
-        </w:rPr>
-        <w:t>Intellektspool</w:t>
-      </w:r>
-      <w:proofErr w:type="spellEnd"/>
-      <w:r>
-        <w:rPr>
-          <w:lang w:val="de-DE"/>
-        </w:rPr>
-        <w:t xml:space="preserve"> und einen Intellekt-Vorteil.</w:t>
+        <w:t>. Jede</w:t>
+      </w:r>
+      <w:r>
+        <w:rPr>
+          <w:lang w:val="de-DE"/>
+        </w:rPr>
+        <w:t>s</w:t>
+      </w:r>
+      <w:r>
+        <w:rPr>
+          <w:lang w:val="de-DE"/>
+        </w:rPr>
+        <w:t xml:space="preserve"> der drei </w:t>
+      </w:r>
+      <w:r>
+        <w:rPr>
+          <w:lang w:val="de-DE"/>
+        </w:rPr>
+        <w:t>Attribute</w:t>
+      </w:r>
+      <w:r>
+        <w:rPr>
+          <w:lang w:val="de-DE"/>
+        </w:rPr>
+        <w:t xml:space="preserve"> besteht aus zwei Komponenten: Pool und Edge, also gibt es einen </w:t>
+      </w:r>
+      <w:r>
+        <w:rPr>
+          <w:lang w:val="de-DE"/>
+        </w:rPr>
+        <w:t>Kraft-</w:t>
+      </w:r>
+      <w:r>
+        <w:rPr>
+          <w:lang w:val="de-DE"/>
+        </w:rPr>
+        <w:t xml:space="preserve">Pool und </w:t>
+      </w:r>
+      <w:r>
+        <w:rPr>
+          <w:lang w:val="de-DE"/>
+        </w:rPr>
+        <w:t>Kraft-</w:t>
+      </w:r>
+      <w:r>
+        <w:rPr>
+          <w:lang w:val="de-DE"/>
+        </w:rPr>
+        <w:t xml:space="preserve">Edge, einen </w:t>
+      </w:r>
+      <w:r>
+        <w:rPr>
+          <w:lang w:val="de-DE"/>
+        </w:rPr>
+        <w:t>Reflex-</w:t>
+      </w:r>
+      <w:r>
+        <w:rPr>
+          <w:lang w:val="de-DE"/>
+        </w:rPr>
+        <w:t xml:space="preserve">Pool und </w:t>
+      </w:r>
+      <w:r>
+        <w:rPr>
+          <w:lang w:val="de-DE"/>
+        </w:rPr>
+        <w:t>Reflex-</w:t>
+      </w:r>
+      <w:r>
+        <w:rPr>
+          <w:lang w:val="de-DE"/>
+        </w:rPr>
+        <w:t>Edge sowie einen Intellekt</w:t>
+      </w:r>
+      <w:r>
+        <w:rPr>
+          <w:lang w:val="de-DE"/>
+        </w:rPr>
+        <w:t>-P</w:t>
+      </w:r>
+      <w:r>
+        <w:rPr>
+          <w:lang w:val="de-DE"/>
+        </w:rPr>
+        <w:t>ool und einen Intellekt-</w:t>
+      </w:r>
+      <w:r>
+        <w:rPr>
+          <w:lang w:val="de-DE"/>
+        </w:rPr>
+        <w:t>Edge</w:t>
+      </w:r>
+      <w:r>
+        <w:rPr>
+          <w:lang w:val="de-DE"/>
+        </w:rPr>
+        <w:t>.</w:t>
       </w:r>
     </w:p>
     <w:p>
@@ -170,7 +553,43 @@
         <w:rPr>
           <w:lang w:val="de-DE"/>
         </w:rPr>
-        <w:t>Die Pools eines Kerncharakters beginnen alle bei 8. Zusätzlich erhalten Sie 6 zusätzliche Punkte, die Sie nach Belieben zu den drei Pools hinzufügen können.</w:t>
+        <w:t>Die Pools eines Kerncharakters beginnen alle bei 8. Zusätzlich erh</w:t>
+      </w:r>
+      <w:r>
+        <w:rPr>
+          <w:lang w:val="de-DE"/>
+        </w:rPr>
+        <w:t xml:space="preserve">ältst du </w:t>
+      </w:r>
+      <w:r>
+        <w:rPr>
+          <w:lang w:val="de-DE"/>
+        </w:rPr>
+        <w:t xml:space="preserve">6 zusätzliche Punkte, die </w:t>
+      </w:r>
+      <w:r>
+        <w:rPr>
+          <w:lang w:val="de-DE"/>
+        </w:rPr>
+        <w:t>du</w:t>
+      </w:r>
+      <w:r>
+        <w:rPr>
+          <w:lang w:val="de-DE"/>
+        </w:rPr>
+        <w:t xml:space="preserve"> nach Belieben zu den drei Pools hinzufügen </w:t>
+      </w:r>
+      <w:r>
+        <w:rPr>
+          <w:lang w:val="de-DE"/>
+        </w:rPr>
+        <w:t>kannst</w:t>
+      </w:r>
+      <w:r>
+        <w:rPr>
+          <w:lang w:val="de-DE"/>
+        </w:rPr>
+        <w:t>.</w:t>
       </w:r>
     </w:p>
     <w:p>
@@ -193,7 +612,7 @@
         <w:rPr>
           <w:lang w:val="de-DE"/>
         </w:rPr>
-        <w:t>Edge reduziert die Punktekosten, wenn du Pool-Punkte ausgibst (es ist wie ein Rabatt). Ein Kerncharakter hat für alle drei Werte einen Edge von 0.</w:t>
+        <w:t>Edge reduziert die Punktekosten, wenn du Pool-Punkte ausgibst (es ist wie ein Rabatt). Ein Kerncharakter hat für alle drei Werte ein Edge von 0.</w:t>
       </w:r>
     </w:p>
     <w:p>
@@ -218,7 +637,45 @@
         <w:rPr>
           <w:lang w:val="de-DE"/>
         </w:rPr>
-        <w:t>Dein Charakter beginnt das Spiel gesund und gesund. Aber du wirst wahrscheinlich irgendwann auf Bedrohungen stoßen und riskieren, verletzt zu werden. Wunden können von so unterschiedlichen Quellen stammen, wie dem Angriff eines Raubtiers, einem Sturz aus großer Höhe oder einem übernatürlichen Effekt wie einer Explosion magischen Feuers. Alles, was dir weh tut, verursacht dir eine Wunde.</w:t>
+        <w:t xml:space="preserve">Dein Charakter beginnt das Spiel gesund und </w:t>
+      </w:r>
+      <w:r>
+        <w:rPr>
+          <w:lang w:val="de-DE"/>
+        </w:rPr>
+        <w:t>munter.</w:t>
+      </w:r>
+      <w:r>
+        <w:rPr>
+          <w:lang w:val="de-DE"/>
+        </w:rPr>
+        <w:t xml:space="preserve"> Aber du wirst wahrscheinlich irgendwann auf Bedrohungen stoßen und riskieren, verletzt zu werden. Wunden können </w:t>
+      </w:r>
+      <w:r>
+        <w:rPr>
+          <w:lang w:val="de-DE"/>
+        </w:rPr>
+        <w:t xml:space="preserve">aus </w:t>
+      </w:r>
+      <w:proofErr w:type="gramStart"/>
+      <w:r>
+        <w:rPr>
+          <w:lang w:val="de-DE"/>
+        </w:rPr>
+        <w:t>ganz</w:t>
+      </w:r>
+      <w:r>
+        <w:rPr>
+          <w:lang w:val="de-DE"/>
+        </w:rPr>
+        <w:t xml:space="preserve"> unterschiedlichen</w:t>
+      </w:r>
+      <w:proofErr w:type="gramEnd"/>
+      <w:r>
+        <w:rPr>
+          <w:lang w:val="de-DE"/>
+        </w:rPr>
+        <w:t xml:space="preserve"> Quellen stammen, wie dem Angriff eines Raubtiers, einem Sturz aus großer Höhe oder einem übernatürlichen Effekt wie einer Explosion magischen Feuers. Alles, was dir weh tut, verursacht eine Wunde.</w:t>
       </w:r>
     </w:p>
     <w:p>
@@ -233,7 +690,19 @@
           <w:lang w:val="de-DE"/>
         </w:rPr>
         <w:lastRenderedPageBreak/>
-        <w:t>Die Wunden treten in drei Schweregraden auf: leicht, mittlere und schwere.</w:t>
+        <w:t xml:space="preserve">Die Wunden treten in drei Schweregraden auf: leicht, </w:t>
+      </w:r>
+      <w:r>
+        <w:rPr>
+          <w:lang w:val="de-DE"/>
+        </w:rPr>
+        <w:t>moderat</w:t>
+      </w:r>
+      <w:r>
+        <w:rPr>
+          <w:lang w:val="de-DE"/>
+        </w:rPr>
+        <w:t xml:space="preserve"> und schwer.</w:t>
       </w:r>
     </w:p>
     <w:p>
@@ -254,14 +723,38 @@
         <w:rPr>
           <w:lang w:val="de-DE"/>
         </w:rPr>
-        <w:t>zu drei kleinere Wunden</w:t>
+        <w:t xml:space="preserve">zu drei </w:t>
+      </w:r>
+      <w:r>
+        <w:rPr>
+          <w:lang w:val="de-DE"/>
+        </w:rPr>
+        <w:t>leichte</w:t>
+      </w:r>
+      <w:r>
+        <w:rPr>
+          <w:lang w:val="de-DE"/>
+        </w:rPr>
+        <w:t xml:space="preserve"> Wunden</w:t>
       </w:r>
       <w:proofErr w:type="gramEnd"/>
       <w:r>
         <w:rPr>
           <w:lang w:val="de-DE"/>
         </w:rPr>
-        <w:t>, drei mittlere und drei schwere Wunden erleiden. Wenn du verwundet bist, notiere die Wunde auf deinem Charakterbogen – für jeden gibt es ein Feld. Jede Art von Wunde hat eine andere Wirkung auf deinen Charakter.</w:t>
+        <w:t xml:space="preserve">, drei </w:t>
+      </w:r>
+      <w:r>
+        <w:rPr>
+          <w:lang w:val="de-DE"/>
+        </w:rPr>
+        <w:t>moderate Wunden</w:t>
+      </w:r>
+      <w:r>
+        <w:rPr>
+          <w:lang w:val="de-DE"/>
+        </w:rPr>
+        <w:t xml:space="preserve"> und drei schwere Wunden erleiden. Wenn du verwundet bist, notiere die Wunde auf deinem Charakterbogen – für jede gibt es ein Feld. Jede Art von Wunde hat eine andere Wirkung auf deinen Charakter.</w:t>
       </w:r>
     </w:p>
     <w:p>
@@ -277,49 +770,99 @@
           <w:bCs/>
           <w:lang w:val="de-DE"/>
         </w:rPr>
-        <w:t>Kleinere Wunden: Das</w:t>
-      </w:r>
-      <w:r>
-        <w:rPr>
-          <w:lang w:val="de-DE"/>
-        </w:rPr>
-        <w:t xml:space="preserve"> sind Schnitte, Kratzer, Prellungen und andere unbedeutende Verletzungen, die nach ein paar Stunden nicht mehr schmerzen. Einzelne kleinere Wunden wirken sich in keiner Weise negativ auf deinen Charakter aus. Wenn du keine kleineren Wunden mehr hast, werden alle neuen kleinen Wunden, die du bekommst, zu mittelschweren Wunden.</w:t>
-      </w:r>
-    </w:p>
-    <w:p>
-      <w:pPr>
-        <w:pStyle w:val="Textkrper"/>
-        <w:rPr>
-          <w:lang w:val="de-DE"/>
-        </w:rPr>
-      </w:pPr>
+        <w:t>Leichte</w:t>
+      </w:r>
       <w:r>
         <w:rPr>
           <w:b/>
           <w:bCs/>
           <w:lang w:val="de-DE"/>
         </w:rPr>
-        <w:t>Mittlere Wunden:</w:t>
-      </w:r>
-      <w:r>
-        <w:rPr>
-          <w:lang w:val="de-DE"/>
-        </w:rPr>
-        <w:t xml:space="preserve"> Dabei handelt es sich um offene Schnitte, Waffenschürfwunden, Verstauchungen, leichte Brüche und andere Verletzungen, die nach ein paar Tagen nicht mehr schmerzen.</w:t>
-      </w:r>
-    </w:p>
-    <w:p>
-      <w:pPr>
-        <w:pStyle w:val="Textkrper"/>
-        <w:rPr>
-          <w:lang w:val="de-DE"/>
-        </w:rPr>
-      </w:pPr>
-      <w:r>
-        <w:rPr>
-          <w:lang w:val="de-DE"/>
-        </w:rPr>
-        <w:t>Wenn du deine letzte mittlere Wunde nimmst, werden alle deine Aktionen behindert, und alle neuen moderaten Wunden, die du erleidest, werden zu schweren Wunden.</w:t>
+        <w:t xml:space="preserve"> Wunden: </w:t>
+      </w:r>
+      <w:r>
+        <w:rPr>
+          <w:lang w:val="de-DE"/>
+        </w:rPr>
+        <w:t>Das</w:t>
+      </w:r>
+      <w:r>
+        <w:rPr>
+          <w:lang w:val="de-DE"/>
+        </w:rPr>
+        <w:t xml:space="preserve"> sind Schnitte, Kratzer, Prellungen und andere unbedeutende Verletzungen, die nach ein paar Stunden nicht mehr schmerzen. Einzelne </w:t>
+      </w:r>
+      <w:r>
+        <w:rPr>
+          <w:lang w:val="de-DE"/>
+        </w:rPr>
+        <w:t>leichte</w:t>
+      </w:r>
+      <w:r>
+        <w:rPr>
+          <w:lang w:val="de-DE"/>
+        </w:rPr>
+        <w:t xml:space="preserve"> Wunden wirken sich in keiner Weise negativ auf deinen Charakter aus. Wenn du keine </w:t>
+      </w:r>
+      <w:r>
+        <w:rPr>
+          <w:lang w:val="de-DE"/>
+        </w:rPr>
+        <w:t>leichten</w:t>
+      </w:r>
+      <w:r>
+        <w:rPr>
+          <w:lang w:val="de-DE"/>
+        </w:rPr>
+        <w:t xml:space="preserve"> Wunden mehr </w:t>
+      </w:r>
+      <w:r>
+        <w:rPr>
+          <w:lang w:val="de-DE"/>
+        </w:rPr>
+        <w:t>erleiden kannst</w:t>
+      </w:r>
+      <w:r>
+        <w:rPr>
+          <w:lang w:val="de-DE"/>
+        </w:rPr>
+        <w:t xml:space="preserve">, werden alle neuen </w:t>
+      </w:r>
+      <w:r>
+        <w:rPr>
+          <w:lang w:val="de-DE"/>
+        </w:rPr>
+        <w:t>leichten</w:t>
+      </w:r>
+      <w:r>
+        <w:rPr>
+          <w:lang w:val="de-DE"/>
+        </w:rPr>
+        <w:t xml:space="preserve"> Wunden, die du </w:t>
+      </w:r>
+      <w:r>
+        <w:rPr>
+          <w:lang w:val="de-DE"/>
+        </w:rPr>
+        <w:t>erleidest</w:t>
+      </w:r>
+      <w:r>
+        <w:rPr>
+          <w:lang w:val="de-DE"/>
+        </w:rPr>
+        <w:t xml:space="preserve">, zu </w:t>
+      </w:r>
+      <w:r>
+        <w:rPr>
+          <w:lang w:val="de-DE"/>
+        </w:rPr>
+        <w:t>moderaten</w:t>
+      </w:r>
+      <w:r>
+        <w:rPr>
+          <w:lang w:val="de-DE"/>
+        </w:rPr>
+        <w:t xml:space="preserve"> Wunden.</w:t>
       </w:r>
     </w:p>
     <w:p>
@@ -335,7 +878,107 @@
           <w:bCs/>
           <w:lang w:val="de-DE"/>
         </w:rPr>
-        <w:t>Schwerwiegende Wunden:</w:t>
+        <w:t>Moderate</w:t>
+      </w:r>
+      <w:r>
+        <w:rPr>
+          <w:b/>
+          <w:bCs/>
+          <w:lang w:val="de-DE"/>
+        </w:rPr>
+        <w:t xml:space="preserve"> Wunden:</w:t>
+      </w:r>
+      <w:r>
+        <w:rPr>
+          <w:lang w:val="de-DE"/>
+        </w:rPr>
+        <w:t xml:space="preserve"> Dabei handelt es sich um offene Schnitte, Waffenschürfwunden, Verstauchungen, leichte Brüche und andere Verletzungen, die nach ein paar Tagen nicht mehr schmerzen.</w:t>
+      </w:r>
+    </w:p>
+    <w:p>
+      <w:pPr>
+        <w:pStyle w:val="Textkrper"/>
+        <w:rPr>
+          <w:lang w:val="de-DE"/>
+        </w:rPr>
+      </w:pPr>
+      <w:r>
+        <w:rPr>
+          <w:lang w:val="de-DE"/>
+        </w:rPr>
+        <w:t xml:space="preserve">Wenn du </w:t>
+      </w:r>
+      <w:r>
+        <w:rPr>
+          <w:lang w:val="de-DE"/>
+        </w:rPr>
+        <w:t>die</w:t>
+      </w:r>
+      <w:r>
+        <w:rPr>
+          <w:lang w:val="de-DE"/>
+        </w:rPr>
+        <w:t xml:space="preserve"> letzte </w:t>
+      </w:r>
+      <w:r>
+        <w:rPr>
+          <w:lang w:val="de-DE"/>
+        </w:rPr>
+        <w:t>moderate</w:t>
+      </w:r>
+      <w:r>
+        <w:rPr>
+          <w:lang w:val="de-DE"/>
+        </w:rPr>
+        <w:t xml:space="preserve"> Wunde</w:t>
+      </w:r>
+      <w:r>
+        <w:rPr>
+          <w:lang w:val="de-DE"/>
+        </w:rPr>
+        <w:t xml:space="preserve"> erleidest, die du erleiden kannst</w:t>
+      </w:r>
+      <w:r>
+        <w:rPr>
+          <w:lang w:val="de-DE"/>
+        </w:rPr>
+        <w:t xml:space="preserve">, werden alle deine Aktionen </w:t>
+      </w:r>
+      <w:r>
+        <w:rPr>
+          <w:lang w:val="de-DE"/>
+        </w:rPr>
+        <w:t>erschwert</w:t>
+      </w:r>
+      <w:r>
+        <w:rPr>
+          <w:lang w:val="de-DE"/>
+        </w:rPr>
+        <w:t xml:space="preserve"> und alle neuen moderaten Wunden, die du erleidest, werden zu schweren Wunden.</w:t>
+      </w:r>
+    </w:p>
+    <w:p>
+      <w:pPr>
+        <w:pStyle w:val="Textkrper"/>
+        <w:rPr>
+          <w:lang w:val="de-DE"/>
+        </w:rPr>
+      </w:pPr>
+      <w:r>
+        <w:rPr>
+          <w:b/>
+          <w:bCs/>
+          <w:lang w:val="de-DE"/>
+        </w:rPr>
+        <w:t>Schwere</w:t>
+      </w:r>
+      <w:r>
+        <w:rPr>
+          <w:b/>
+          <w:bCs/>
+          <w:lang w:val="de-DE"/>
+        </w:rPr>
+        <w:t xml:space="preserve"> Wunden:</w:t>
       </w:r>
       <w:r>
         <w:rPr>
@@ -355,7 +998,31 @@
         <w:rPr>
           <w:lang w:val="de-DE"/>
         </w:rPr>
-        <w:t>Jede schwere Wunde, die du erleidest, behindert all deine Handlungen.</w:t>
+        <w:t xml:space="preserve">Jede schwere Wunde, die du erleidest, </w:t>
+      </w:r>
+      <w:r>
+        <w:rPr>
+          <w:lang w:val="de-DE"/>
+        </w:rPr>
+        <w:t>erschwert</w:t>
+      </w:r>
+      <w:r>
+        <w:rPr>
+          <w:lang w:val="de-DE"/>
+        </w:rPr>
+        <w:t xml:space="preserve"> all</w:t>
+      </w:r>
+      <w:r>
+        <w:rPr>
+          <w:lang w:val="de-DE"/>
+        </w:rPr>
+        <w:t>e</w:t>
+      </w:r>
+      <w:r>
+        <w:rPr>
+          <w:lang w:val="de-DE"/>
+        </w:rPr>
+        <w:t xml:space="preserve"> deine Handlungen.</w:t>
       </w:r>
     </w:p>
     <w:p>
@@ -369,7 +1036,19 @@
         <w:rPr>
           <w:lang w:val="de-DE"/>
         </w:rPr>
-        <w:t>Wenn du deine letzte schwere Wunde erleidest, stirbst du.</w:t>
+        <w:t>Wenn du deine letzte</w:t>
+      </w:r>
+      <w:r>
+        <w:rPr>
+          <w:lang w:val="de-DE"/>
+        </w:rPr>
+        <w:t xml:space="preserve"> mögliche</w:t>
+      </w:r>
+      <w:r>
+        <w:rPr>
+          <w:lang w:val="de-DE"/>
+        </w:rPr>
+        <w:t xml:space="preserve"> schwere Wunde erleidest, stirbst du.</w:t>
       </w:r>
     </w:p>
     <w:p>
@@ -379,7 +1058,7 @@
       <w:bookmarkStart w:id="6" w:name="skills"/>
       <w:bookmarkEnd w:id="5"/>
       <w:r>
-        <w:t>Fähigkeiten</w:t>
+        <w:t>Fertigkeiten</w:t>
       </w:r>
     </w:p>
     <w:p>
@@ -393,7 +1072,79 @@
         <w:rPr>
           <w:lang w:val="de-DE"/>
         </w:rPr>
-        <w:t>Eine Fähigkeit ist jede Art von Wissen oder Fähigkeit, in der du durch Übung und Training besser werden kannst. Sport, Wahrnehmung, Computer und Geschichte sind Beispiele für Fähigkeiten. Eine Fähigkeit zu haben, macht Aufgaben, die mit dieser Fähigkeit zu tun haben, einfacher.</w:t>
+        <w:t xml:space="preserve">Eine </w:t>
+      </w:r>
+      <w:r>
+        <w:rPr>
+          <w:lang w:val="de-DE"/>
+        </w:rPr>
+        <w:t>Fertigkeit</w:t>
+      </w:r>
+      <w:r>
+        <w:rPr>
+          <w:lang w:val="de-DE"/>
+        </w:rPr>
+        <w:t xml:space="preserve"> ist jede Art von Wissen oder Fähigkeit, in der du durch Übung und Training besser werden kannst. </w:t>
+      </w:r>
+      <w:r>
+        <w:rPr>
+          <w:lang w:val="de-DE"/>
+        </w:rPr>
+        <w:t>Athletik</w:t>
+      </w:r>
+      <w:r>
+        <w:rPr>
+          <w:lang w:val="de-DE"/>
+        </w:rPr>
+        <w:t xml:space="preserve">, Wahrnehmung, Computer und Geschichte sind Beispiele für </w:t>
+      </w:r>
+      <w:r>
+        <w:rPr>
+          <w:lang w:val="de-DE"/>
+        </w:rPr>
+        <w:t>Fertigkeiten</w:t>
+      </w:r>
+      <w:r>
+        <w:rPr>
+          <w:lang w:val="de-DE"/>
+        </w:rPr>
+        <w:t xml:space="preserve">. Eine </w:t>
+      </w:r>
+      <w:r>
+        <w:rPr>
+          <w:lang w:val="de-DE"/>
+        </w:rPr>
+        <w:t>Fertigkeit</w:t>
+      </w:r>
+      <w:r>
+        <w:rPr>
+          <w:lang w:val="de-DE"/>
+        </w:rPr>
+        <w:t xml:space="preserve"> zu haben, macht Aufgaben</w:t>
+      </w:r>
+      <w:r>
+        <w:rPr>
+          <w:lang w:val="de-DE"/>
+        </w:rPr>
+        <w:t xml:space="preserve"> leichter</w:t>
+      </w:r>
+      <w:r>
+        <w:rPr>
+          <w:lang w:val="de-DE"/>
+        </w:rPr>
+        <w:t xml:space="preserve">, die mit dieser </w:t>
+      </w:r>
+      <w:r>
+        <w:rPr>
+          <w:lang w:val="de-DE"/>
+        </w:rPr>
+        <w:t>Fertigkeit</w:t>
+      </w:r>
+      <w:r>
+        <w:rPr>
+          <w:lang w:val="de-DE"/>
+        </w:rPr>
+        <w:t xml:space="preserve"> zu tun haben.</w:t>
       </w:r>
     </w:p>
     <w:p>
@@ -415,41 +1166,7 @@
           <w:bCs/>
           <w:lang w:val="de-DE"/>
         </w:rPr>
-        <w:t>zwei Fähigkeiten</w:t>
-      </w:r>
-      <w:r>
-        <w:rPr>
-          <w:lang w:val="de-DE"/>
-        </w:rPr>
-        <w:t xml:space="preserve">. Die Fähigkeiten, aus denen du wählen kannst, hängen vom Genre des Spiels ab, das der Spielleiter leitet (wie </w:t>
-      </w:r>
-      <w:proofErr w:type="spellStart"/>
-      <w:r>
-        <w:rPr>
-          <w:lang w:val="de-DE"/>
-        </w:rPr>
-        <w:t>Sci-Fi</w:t>
-      </w:r>
-      <w:proofErr w:type="spellEnd"/>
-      <w:r>
-        <w:rPr>
-          <w:lang w:val="de-DE"/>
-        </w:rPr>
-        <w:t>, Fantasy oder Postapokalypse).</w:t>
-      </w:r>
-    </w:p>
-    <w:p>
-      <w:pPr>
-        <w:pStyle w:val="Textkrper"/>
-        <w:rPr>
-          <w:lang w:val="de-DE"/>
-        </w:rPr>
-      </w:pPr>
-      <w:r>
-        <w:rPr>
-          <w:lang w:val="de-DE"/>
-        </w:rPr>
-        <w:t xml:space="preserve">Du hast die Möglichkeit, mit einer dritten Fähigkeit zu beginnen, aber im Gegenzug musst du eine sinnvolle Fähigkeit wählen, in der du schlecht bist (genannt </w:t>
+        <w:t xml:space="preserve">zwei </w:t>
       </w:r>
       <w:r>
         <w:rPr>
@@ -457,13 +1174,187 @@
           <w:bCs/>
           <w:lang w:val="de-DE"/>
         </w:rPr>
+        <w:t>Fertigkeiten</w:t>
+      </w:r>
+      <w:r>
+        <w:rPr>
+          <w:lang w:val="de-DE"/>
+        </w:rPr>
+        <w:t xml:space="preserve">. Die </w:t>
+      </w:r>
+      <w:r>
+        <w:rPr>
+          <w:lang w:val="de-DE"/>
+        </w:rPr>
+        <w:t>Fertigkeiten</w:t>
+      </w:r>
+      <w:r>
+        <w:rPr>
+          <w:lang w:val="de-DE"/>
+        </w:rPr>
+        <w:t xml:space="preserve">, aus denen du wählen kannst, hängen vom Genre des Spiels ab, das </w:t>
+      </w:r>
+      <w:r>
+        <w:rPr>
+          <w:lang w:val="de-DE"/>
+        </w:rPr>
+        <w:t>die</w:t>
+      </w:r>
+      <w:r>
+        <w:rPr>
+          <w:lang w:val="de-DE"/>
+        </w:rPr>
+        <w:t xml:space="preserve"> Spielleit</w:t>
+      </w:r>
+      <w:r>
+        <w:rPr>
+          <w:lang w:val="de-DE"/>
+        </w:rPr>
+        <w:t>ung</w:t>
+      </w:r>
+      <w:r>
+        <w:rPr>
+          <w:lang w:val="de-DE"/>
+        </w:rPr>
+        <w:t xml:space="preserve"> leitet (wie </w:t>
+      </w:r>
+      <w:proofErr w:type="spellStart"/>
+      <w:r>
+        <w:rPr>
+          <w:lang w:val="de-DE"/>
+        </w:rPr>
+        <w:t>Sci-Fi</w:t>
+      </w:r>
+      <w:proofErr w:type="spellEnd"/>
+      <w:r>
+        <w:rPr>
+          <w:lang w:val="de-DE"/>
+        </w:rPr>
+        <w:t>, Fantasy oder Postapokalypse).</w:t>
+      </w:r>
+    </w:p>
+    <w:p>
+      <w:pPr>
+        <w:pStyle w:val="Textkrper"/>
+        <w:rPr>
+          <w:lang w:val="de-DE"/>
+        </w:rPr>
+      </w:pPr>
+      <w:r>
+        <w:rPr>
+          <w:lang w:val="de-DE"/>
+        </w:rPr>
+        <w:t xml:space="preserve">Du hast die Möglichkeit, mit einer dritten </w:t>
+      </w:r>
+      <w:r>
+        <w:rPr>
+          <w:lang w:val="de-DE"/>
+        </w:rPr>
+        <w:t>Fertigkeit</w:t>
+      </w:r>
+      <w:r>
+        <w:rPr>
+          <w:lang w:val="de-DE"/>
+        </w:rPr>
+        <w:t xml:space="preserve"> zu beginnen, aber im Gegenzug musst du eine sinnvolle </w:t>
+      </w:r>
+      <w:r>
+        <w:rPr>
+          <w:lang w:val="de-DE"/>
+        </w:rPr>
+        <w:t>Fertigkeit</w:t>
+      </w:r>
+      <w:r>
+        <w:rPr>
+          <w:lang w:val="de-DE"/>
+        </w:rPr>
+        <w:t xml:space="preserve"> wählen, in der du schlecht bist (genannt </w:t>
+      </w:r>
+      <w:r>
+        <w:rPr>
+          <w:b/>
+          <w:bCs/>
+          <w:lang w:val="de-DE"/>
+        </w:rPr>
         <w:t>Unfähigkeit</w:t>
       </w:r>
       <w:r>
         <w:rPr>
           <w:lang w:val="de-DE"/>
         </w:rPr>
-        <w:t>). Eine Unfähigkeit in einer Fähigkeit zu haben, macht Aufgaben, die mit dieser Fähigkeit zu tun haben, schwieriger. Zum Beispiel könntest du Athletik als dritte Fähigkeit wählen, aber du müsstest eine andere Fähigkeit (wie Wahrnehmung oder Schleichen) wählen, um schlecht zu sein.</w:t>
+        <w:t xml:space="preserve">). Eine Unfähigkeit in einer </w:t>
+      </w:r>
+      <w:r>
+        <w:rPr>
+          <w:lang w:val="de-DE"/>
+        </w:rPr>
+        <w:t>Fertigkeit</w:t>
+      </w:r>
+      <w:r>
+        <w:rPr>
+          <w:lang w:val="de-DE"/>
+        </w:rPr>
+        <w:t xml:space="preserve"> zu haben, macht Aufgaben</w:t>
+      </w:r>
+      <w:r>
+        <w:rPr>
+          <w:lang w:val="de-DE"/>
+        </w:rPr>
+        <w:t xml:space="preserve"> schwieriger</w:t>
+      </w:r>
+      <w:r>
+        <w:rPr>
+          <w:lang w:val="de-DE"/>
+        </w:rPr>
+        <w:t xml:space="preserve">, die mit dieser </w:t>
+      </w:r>
+      <w:r>
+        <w:rPr>
+          <w:lang w:val="de-DE"/>
+        </w:rPr>
+        <w:t>Fertigkeit</w:t>
+      </w:r>
+      <w:r>
+        <w:rPr>
+          <w:lang w:val="de-DE"/>
+        </w:rPr>
+        <w:t xml:space="preserve"> zu tun haben. Zum Beispiel könntest du Athletik als dritte </w:t>
+      </w:r>
+      <w:r>
+        <w:rPr>
+          <w:lang w:val="de-DE"/>
+        </w:rPr>
+        <w:t>Fertigkeit</w:t>
+      </w:r>
+      <w:r>
+        <w:rPr>
+          <w:lang w:val="de-DE"/>
+        </w:rPr>
+        <w:t xml:space="preserve"> wählen, aber du müsstest eine andere </w:t>
+      </w:r>
+      <w:r>
+        <w:rPr>
+          <w:lang w:val="de-DE"/>
+        </w:rPr>
+        <w:t>Fertigkeit</w:t>
+      </w:r>
+      <w:r>
+        <w:rPr>
+          <w:lang w:val="de-DE"/>
+        </w:rPr>
+        <w:t xml:space="preserve"> (wie Wahrnehmung oder Schleichen) wählen, </w:t>
+      </w:r>
+      <w:r>
+        <w:rPr>
+          <w:lang w:val="de-DE"/>
+        </w:rPr>
+        <w:t>in der du unfähig bist</w:t>
+      </w:r>
+      <w:r>
+        <w:rPr>
+          <w:lang w:val="de-DE"/>
+        </w:rPr>
+        <w:t>.</w:t>
       </w:r>
     </w:p>
     <w:p>
@@ -477,7 +1368,31 @@
         <w:rPr>
           <w:lang w:val="de-DE"/>
         </w:rPr>
-        <w:t>Wenn du eine Fähigkeit wegen deiner Unfähigkeit wählst, muss es etwas Bedeutendes sein, das deinen Charakter von Zeit zu Zeit stark beeinflussen kann, wie Athletik, Wahrnehmung oder Charme, nicht eine Fähigkeit wie Landwirtschaft oder Philosophie.</w:t>
+        <w:t xml:space="preserve">Wenn du eine </w:t>
+      </w:r>
+      <w:r>
+        <w:rPr>
+          <w:lang w:val="de-DE"/>
+        </w:rPr>
+        <w:t>Fertigkeit</w:t>
+      </w:r>
+      <w:r>
+        <w:rPr>
+          <w:lang w:val="de-DE"/>
+        </w:rPr>
+        <w:t xml:space="preserve"> </w:t>
+      </w:r>
+      <w:r>
+        <w:rPr>
+          <w:lang w:val="de-DE"/>
+        </w:rPr>
+        <w:t>für deine</w:t>
+      </w:r>
+      <w:r>
+        <w:rPr>
+          <w:lang w:val="de-DE"/>
+        </w:rPr>
+        <w:t xml:space="preserve"> Unfähigkeit wählst, muss es etwas Bedeutendes sein, das deinen Charakter von Zeit zu Zeit stark beeinflussen kann, wie Athletik, Wahrnehmung oder Charme, nicht eine Fähigkeit wie Landwirtschaft oder Philosophie.</w:t>
       </w:r>
     </w:p>
     <w:p>
@@ -488,7 +1403,7 @@
       <w:bookmarkEnd w:id="6"/>
       <w:r>
         <w:lastRenderedPageBreak/>
-        <w:t>Einsatz</w:t>
+        <w:t>Anstrengung</w:t>
       </w:r>
     </w:p>
     <w:p>
@@ -502,21 +1417,35 @@
         <w:rPr>
           <w:lang w:val="de-DE"/>
         </w:rPr>
-        <w:t xml:space="preserve">Wenn du </w:t>
+        <w:t>Wenn du eine Aufgabe</w:t>
+      </w:r>
+      <w:r>
+        <w:rPr>
+          <w:lang w:val="de-DE"/>
+        </w:rPr>
+        <w:t xml:space="preserve"> </w:t>
       </w:r>
       <w:proofErr w:type="gramStart"/>
       <w:r>
         <w:rPr>
           <w:lang w:val="de-DE"/>
         </w:rPr>
-        <w:t>wirklich eine</w:t>
-      </w:r>
+        <w:t xml:space="preserve">wirklich </w:t>
+      </w:r>
+      <w:proofErr w:type="spellStart"/>
+      <w:r>
+        <w:rPr>
+          <w:lang w:val="de-DE"/>
+        </w:rPr>
+        <w:t>erfolgreid</w:t>
+      </w:r>
+      <w:proofErr w:type="spellEnd"/>
       <w:proofErr w:type="gramEnd"/>
       <w:r>
         <w:rPr>
           <w:lang w:val="de-DE"/>
         </w:rPr>
-        <w:t xml:space="preserve"> Aufgabe erledigen musst, kannst du dich mehr anstrengen. Im Spielbegriff nennt man das </w:t>
+        <w:t xml:space="preserve"> erledigen musst, kannst du dich mehr anstrengen. Im Spielbegriff nennt man das </w:t>
       </w:r>
       <w:r>
         <w:rPr>
@@ -530,7 +1459,31 @@
         <w:rPr>
           <w:lang w:val="de-DE"/>
         </w:rPr>
-        <w:t>. Das Anwenden von Anstrengung kostet 3 Punkte aus dem entsprechenden Status-Pool. Anstrengung macht eine Aufgabe leichter, genauso wie eine Fähigkeit.</w:t>
+        <w:t xml:space="preserve">. Das Anwenden von Anstrengung kostet 3 Punkte aus dem entsprechenden </w:t>
+      </w:r>
+      <w:r>
+        <w:rPr>
+          <w:lang w:val="de-DE"/>
+        </w:rPr>
+        <w:t>Werte</w:t>
+      </w:r>
+      <w:r>
+        <w:rPr>
+          <w:lang w:val="de-DE"/>
+        </w:rPr>
+        <w:t xml:space="preserve">-Pool. Anstrengung macht eine Aufgabe leichter, genauso wie eine </w:t>
+      </w:r>
+      <w:r>
+        <w:rPr>
+          <w:lang w:val="de-DE"/>
+        </w:rPr>
+        <w:t>Fertigkeit</w:t>
+      </w:r>
+      <w:r>
+        <w:rPr>
+          <w:lang w:val="de-DE"/>
+        </w:rPr>
+        <w:t>.</w:t>
       </w:r>
     </w:p>
     <w:p>
@@ -544,7 +1497,87 @@
         <w:rPr>
           <w:lang w:val="de-DE"/>
         </w:rPr>
-        <w:t>Ein Kerncharakter hat einen Einsatz von 1, das heißt, du kannst Anstrengung nur nutzen, um eine Aufgabe um einen Schritt zu erleichtern. Ein Charakter mit einem höheren Effort-Wert kann mehr Aufwand auf eine Aufgabe investieren und sie um zusätzliche Schritte erleichtern.</w:t>
+        <w:t xml:space="preserve">Ein Kerncharakter hat einen </w:t>
+      </w:r>
+      <w:r>
+        <w:rPr>
+          <w:lang w:val="de-DE"/>
+        </w:rPr>
+        <w:t>Anstrengungswert</w:t>
+      </w:r>
+      <w:r>
+        <w:rPr>
+          <w:lang w:val="de-DE"/>
+        </w:rPr>
+        <w:t xml:space="preserve"> von 1, das heißt, du kannst Anstrengung nur nutzen, um eine Aufgabe um einen Schritt zu erleichtern. Ein Charakter mit einem höheren </w:t>
+      </w:r>
+      <w:proofErr w:type="spellStart"/>
+      <w:r>
+        <w:rPr>
+          <w:lang w:val="de-DE"/>
+        </w:rPr>
+        <w:t>Anstrenguntsw</w:t>
+      </w:r>
+      <w:r>
+        <w:rPr>
+          <w:lang w:val="de-DE"/>
+        </w:rPr>
+        <w:t>ert</w:t>
+      </w:r>
+      <w:proofErr w:type="spellEnd"/>
+      <w:r>
+        <w:rPr>
+          <w:lang w:val="de-DE"/>
+        </w:rPr>
+        <w:t xml:space="preserve"> kann mehr </w:t>
+      </w:r>
+      <w:r>
+        <w:rPr>
+          <w:lang w:val="de-DE"/>
+        </w:rPr>
+        <w:t>Anstrengung</w:t>
+      </w:r>
+      <w:r>
+        <w:rPr>
+          <w:lang w:val="de-DE"/>
+        </w:rPr>
+        <w:t xml:space="preserve"> </w:t>
+      </w:r>
+      <w:r>
+        <w:rPr>
+          <w:lang w:val="de-DE"/>
+        </w:rPr>
+        <w:t>bei</w:t>
+      </w:r>
+      <w:r>
+        <w:rPr>
+          <w:lang w:val="de-DE"/>
+        </w:rPr>
+        <w:t xml:space="preserve"> eine</w:t>
+      </w:r>
+      <w:r>
+        <w:rPr>
+          <w:lang w:val="de-DE"/>
+        </w:rPr>
+        <w:t>r</w:t>
+      </w:r>
+      <w:r>
+        <w:rPr>
+          <w:lang w:val="de-DE"/>
+        </w:rPr>
+        <w:t xml:space="preserve"> Aufgabe </w:t>
+      </w:r>
+      <w:r>
+        <w:rPr>
+          <w:lang w:val="de-DE"/>
+        </w:rPr>
+        <w:t>anwenden</w:t>
+      </w:r>
+      <w:r>
+        <w:rPr>
+          <w:lang w:val="de-DE"/>
+        </w:rPr>
+        <w:t xml:space="preserve"> und sie um zusätzliche Schritte erleichtern.</w:t>
       </w:r>
     </w:p>
     <w:p>
@@ -554,7 +1587,7 @@
       <w:bookmarkStart w:id="8" w:name="asset"/>
       <w:bookmarkEnd w:id="7"/>
       <w:r>
-        <w:t>Vermögenswert</w:t>
+        <w:t>Vorteil</w:t>
       </w:r>
     </w:p>
     <w:p>
@@ -576,13 +1609,61 @@
           <w:bCs/>
           <w:lang w:val="de-DE"/>
         </w:rPr>
-        <w:t>Asset</w:t>
-      </w:r>
-      <w:r>
-        <w:rPr>
-          <w:lang w:val="de-DE"/>
-        </w:rPr>
-        <w:t xml:space="preserve"> ist jedes Objekt, jede Situation oder jede Unterstützung, die Ihnen bei einer Aufgabe hilft. Wenn du versuchst, eine Tür aufzubrechen, ist eine Brechstange ein Vorteil. Wenn du versuchst, ein Feuer zu löschen, ist ein Regensturm ein Vorteil. Wenn du versuchst, über einen Zaun zu klettern, ist es ein Vorteil, dass dein Freund dir einen Schub gibt (also hilft). Wenn du gegen ein Monster kämpfst, ist es ein Vorteil, dass das Monster durch starke Winde abgelenkt wird.</w:t>
+        <w:t>Vorteil</w:t>
+      </w:r>
+      <w:r>
+        <w:rPr>
+          <w:lang w:val="de-DE"/>
+        </w:rPr>
+        <w:t xml:space="preserve"> ist jede</w:t>
+      </w:r>
+      <w:r>
+        <w:rPr>
+          <w:lang w:val="de-DE"/>
+        </w:rPr>
+        <w:t>r</w:t>
+      </w:r>
+      <w:r>
+        <w:rPr>
+          <w:lang w:val="de-DE"/>
+        </w:rPr>
+        <w:t xml:space="preserve"> </w:t>
+      </w:r>
+      <w:r>
+        <w:rPr>
+          <w:lang w:val="de-DE"/>
+        </w:rPr>
+        <w:t>Gegenstand</w:t>
+      </w:r>
+      <w:r>
+        <w:rPr>
+          <w:lang w:val="de-DE"/>
+        </w:rPr>
+        <w:t xml:space="preserve">, jede Situation oder jede Unterstützung, die </w:t>
+      </w:r>
+      <w:r>
+        <w:rPr>
+          <w:lang w:val="de-DE"/>
+        </w:rPr>
+        <w:t>dir</w:t>
+      </w:r>
+      <w:r>
+        <w:rPr>
+          <w:lang w:val="de-DE"/>
+        </w:rPr>
+        <w:t xml:space="preserve"> bei einer Aufgabe hilft. Wenn du versuchst, eine Tür aufzubrechen, ist eine Brechstange ein Vorteil. Wenn du versuchst, ein Feuer zu löschen, ist ein Regensturm ein Vorteil. Wenn du versuchst, über einen Zaun zu klettern, ist es ein Vorteil, dass dein Freund dir einen Schub gibt (</w:t>
+      </w:r>
+      <w:r>
+        <w:rPr>
+          <w:lang w:val="de-DE"/>
+        </w:rPr>
+        <w:t>d.h. er dir</w:t>
+      </w:r>
+      <w:r>
+        <w:rPr>
+          <w:lang w:val="de-DE"/>
+        </w:rPr>
+        <w:t xml:space="preserve"> hilft). Wenn du gegen ein Monster kämpfst, ist es ein Vorteil, dass das Monster durch starke Winde abgelenkt wird.</w:t>
       </w:r>
     </w:p>
     <w:p>
@@ -596,21 +1677,75 @@
         <w:rPr>
           <w:lang w:val="de-DE"/>
         </w:rPr>
-        <w:t xml:space="preserve">Ein Asset erleichtert eine Aufgabe normalerweise um einen Schritt. Ein </w:t>
+        <w:t xml:space="preserve">Ein </w:t>
+      </w:r>
+      <w:r>
+        <w:rPr>
+          <w:lang w:val="de-DE"/>
+        </w:rPr>
+        <w:t>Vorteil</w:t>
+      </w:r>
+      <w:r>
+        <w:rPr>
+          <w:lang w:val="de-DE"/>
+        </w:rPr>
+        <w:t xml:space="preserve"> erleichtert eine Aufgabe normalerweise um einen Schritt. Ein </w:t>
       </w:r>
       <w:proofErr w:type="gramStart"/>
       <w:r>
         <w:rPr>
           <w:lang w:val="de-DE"/>
         </w:rPr>
-        <w:t>wirklich gutes</w:t>
+        <w:t xml:space="preserve">wirklich </w:t>
+      </w:r>
+      <w:r>
+        <w:rPr>
+          <w:lang w:val="de-DE"/>
+        </w:rPr>
+        <w:t>guter</w:t>
       </w:r>
       <w:proofErr w:type="gramEnd"/>
       <w:r>
         <w:rPr>
           <w:lang w:val="de-DE"/>
         </w:rPr>
-        <w:t xml:space="preserve"> Asset (oder zwei normale Assets) kann eine Aufgabe um zwei Schritte erleichtern. Vermögenswerte können eine Aufgabe nie um mehr als zwei Schritte erleichtern – mehr als zwei Schritte zählen nicht.</w:t>
+        <w:t xml:space="preserve"> </w:t>
+      </w:r>
+      <w:r>
+        <w:rPr>
+          <w:lang w:val="de-DE"/>
+        </w:rPr>
+        <w:t>Vorteil</w:t>
+      </w:r>
+      <w:r>
+        <w:rPr>
+          <w:lang w:val="de-DE"/>
+        </w:rPr>
+        <w:t xml:space="preserve"> (oder zwei normale </w:t>
+      </w:r>
+      <w:r>
+        <w:rPr>
+          <w:lang w:val="de-DE"/>
+        </w:rPr>
+        <w:t>Vorteile</w:t>
+      </w:r>
+      <w:r>
+        <w:rPr>
+          <w:lang w:val="de-DE"/>
+        </w:rPr>
+        <w:t xml:space="preserve">) kann eine Aufgabe um zwei Schritte erleichtern. </w:t>
+      </w:r>
+      <w:r>
+        <w:rPr>
+          <w:lang w:val="de-DE"/>
+        </w:rPr>
+        <w:t>Vorteile</w:t>
+      </w:r>
+      <w:r>
+        <w:rPr>
+          <w:lang w:val="de-DE"/>
+        </w:rPr>
+        <w:t xml:space="preserve"> können eine Aufgabe nie um mehr als zwei Schritte erleichtern – mehr als zwei Schritte zählen nicht.</w:t>
       </w:r>
     </w:p>
     <w:p>
@@ -620,7 +1755,7 @@
       <w:bookmarkStart w:id="9" w:name="cyphers"/>
       <w:bookmarkEnd w:id="8"/>
       <w:r>
-        <w:t>Cyphers</w:t>
+        <w:t>Cypher</w:t>
       </w:r>
     </w:p>
     <w:p>
@@ -634,21 +1769,103 @@
         <w:rPr>
           <w:lang w:val="de-DE"/>
         </w:rPr>
-        <w:t xml:space="preserve">Cyphers sind Einwegfähigkeiten, die dein Charakter hat. Sie ändern sich von Sitzung zu Sitzung, und du bekommst immer mehr davon, also nutze sie, wenn du sie brauchst (horte sie nicht). Ein Cypher kann ein bisschen Glück sein, der dir hilft, ein Moment der Inspiration für die Lösung eines Problems oder ein Adrenalinstoß, der dich über deine normalen Grenzen </w:t>
-      </w:r>
-      <w:proofErr w:type="gramStart"/>
-      <w:r>
-        <w:rPr>
-          <w:lang w:val="de-DE"/>
-        </w:rPr>
-        <w:t>hinaus treibt</w:t>
-      </w:r>
-      <w:proofErr w:type="gramEnd"/>
-      <w:r>
-        <w:rPr>
-          <w:lang w:val="de-DE"/>
-        </w:rPr>
-        <w:t>. Der Spielleiter sagt dir, welche Chiffren du hast, und entscheidet, wann du Ersatz für die benutzten bekommst.</w:t>
+        <w:t>Cypher sind Ein</w:t>
+      </w:r>
+      <w:r>
+        <w:rPr>
+          <w:lang w:val="de-DE"/>
+        </w:rPr>
+        <w:t>mal</w:t>
+      </w:r>
+      <w:r>
+        <w:rPr>
+          <w:lang w:val="de-DE"/>
+        </w:rPr>
+        <w:t>fähigkeiten, die dein Charakter hat. Sie ändern sich von Sitzung zu Sitzung</w:t>
+      </w:r>
+      <w:r>
+        <w:rPr>
+          <w:lang w:val="de-DE"/>
+        </w:rPr>
+        <w:t xml:space="preserve"> </w:t>
+      </w:r>
+      <w:r>
+        <w:rPr>
+          <w:lang w:val="de-DE"/>
+        </w:rPr>
+        <w:t xml:space="preserve">und du bekommst immer mehr davon, </w:t>
+      </w:r>
+      <w:r>
+        <w:rPr>
+          <w:lang w:val="de-DE"/>
+        </w:rPr>
+        <w:t>das bedeutet, du solltest sie</w:t>
+      </w:r>
+      <w:r>
+        <w:rPr>
+          <w:lang w:val="de-DE"/>
+        </w:rPr>
+        <w:t xml:space="preserve"> nutze</w:t>
+      </w:r>
+      <w:r>
+        <w:rPr>
+          <w:lang w:val="de-DE"/>
+        </w:rPr>
+        <w:t>n</w:t>
+      </w:r>
+      <w:r>
+        <w:rPr>
+          <w:lang w:val="de-DE"/>
+        </w:rPr>
+        <w:t xml:space="preserve">, wenn du sie brauchst (horte sie nicht). Ein Cypher kann ein bisschen Glück sein, der dir hilft, ein Moment der Inspiration für die Lösung eines Problems oder ein Adrenalinstoß, der dich über deine normalen Grenzen </w:t>
+      </w:r>
+      <w:r>
+        <w:rPr>
+          <w:lang w:val="de-DE"/>
+        </w:rPr>
+        <w:t>hinaustreibt</w:t>
+      </w:r>
+      <w:r>
+        <w:rPr>
+          <w:lang w:val="de-DE"/>
+        </w:rPr>
+        <w:t>. D</w:t>
+      </w:r>
+      <w:r>
+        <w:rPr>
+          <w:lang w:val="de-DE"/>
+        </w:rPr>
+        <w:t>ie</w:t>
+      </w:r>
+      <w:r>
+        <w:rPr>
+          <w:lang w:val="de-DE"/>
+        </w:rPr>
+        <w:t xml:space="preserve"> Spielleit</w:t>
+      </w:r>
+      <w:r>
+        <w:rPr>
+          <w:lang w:val="de-DE"/>
+        </w:rPr>
+        <w:t xml:space="preserve">ung </w:t>
+      </w:r>
+      <w:r>
+        <w:rPr>
+          <w:lang w:val="de-DE"/>
+        </w:rPr>
+        <w:t xml:space="preserve">sagt dir, welche </w:t>
+      </w:r>
+      <w:r>
+        <w:rPr>
+          <w:lang w:val="de-DE"/>
+        </w:rPr>
+        <w:t>Cypher</w:t>
+      </w:r>
+      <w:r>
+        <w:rPr>
+          <w:lang w:val="de-DE"/>
+        </w:rPr>
+        <w:t xml:space="preserve"> du hast, und entscheidet, wann du Ersatz für die benutzten bekommst.</w:t>
       </w:r>
     </w:p>
     <w:p>
@@ -662,7 +1879,19 @@
         <w:rPr>
           <w:lang w:val="de-DE"/>
         </w:rPr>
-        <w:t xml:space="preserve">Du kannst bis zu zwei Chiffren gleichzeitig haben; das ist dein </w:t>
+        <w:t xml:space="preserve">Du kannst bis zu zwei </w:t>
+      </w:r>
+      <w:r>
+        <w:rPr>
+          <w:lang w:val="de-DE"/>
+        </w:rPr>
+        <w:t>Cypher</w:t>
+      </w:r>
+      <w:r>
+        <w:rPr>
+          <w:lang w:val="de-DE"/>
+        </w:rPr>
+        <w:t xml:space="preserve"> gleichzeitig haben; das ist dein </w:t>
       </w:r>
       <w:r>
         <w:rPr>
@@ -670,7 +1899,15 @@
           <w:bCs/>
           <w:lang w:val="de-DE"/>
         </w:rPr>
-        <w:t>Chiffre-Limit.</w:t>
+        <w:t>Cypher</w:t>
+      </w:r>
+      <w:r>
+        <w:rPr>
+          <w:b/>
+          <w:bCs/>
+          <w:lang w:val="de-DE"/>
+        </w:rPr>
+        <w:t>-Limit.</w:t>
       </w:r>
     </w:p>
     <w:p>
@@ -680,7 +1917,7 @@
       <w:bookmarkStart w:id="10" w:name="recoveries"/>
       <w:bookmarkEnd w:id="9"/>
       <w:r>
-        <w:t>Bergungen</w:t>
+        <w:t>Erholungen</w:t>
       </w:r>
     </w:p>
     <w:p>
@@ -694,7 +1931,31 @@
         <w:rPr>
           <w:lang w:val="de-DE"/>
         </w:rPr>
-        <w:t xml:space="preserve">Um Punkte aus deinen Pools zurückzugewinnen, rastest du dich aus und machst eine </w:t>
+        <w:t xml:space="preserve">Um Punkte aus deinen Pools zurückzugewinnen, </w:t>
+      </w:r>
+      <w:r>
+        <w:rPr>
+          <w:lang w:val="de-DE"/>
+        </w:rPr>
+        <w:t>erholst</w:t>
+      </w:r>
+      <w:r>
+        <w:rPr>
+          <w:lang w:val="de-DE"/>
+        </w:rPr>
+        <w:t xml:space="preserve"> du dich und machst eine</w:t>
+      </w:r>
+      <w:r>
+        <w:rPr>
+          <w:lang w:val="de-DE"/>
+        </w:rPr>
+        <w:t>n</w:t>
+      </w:r>
+      <w:r>
+        <w:rPr>
+          <w:lang w:val="de-DE"/>
+        </w:rPr>
+        <w:t xml:space="preserve"> </w:t>
       </w:r>
       <w:r>
         <w:rPr>
@@ -706,9 +1967,49 @@
       </w:r>
       <w:r>
         <w:rPr>
-          <w:lang w:val="de-DE"/>
-        </w:rPr>
-        <w:t>. Die Erholung eines Kerncharakters entspricht einem 1W6-Wurf plus seiner Stufe, also 1W6 + 1. Das Ergebnis des Wurfs ist, wie viele Punkte du zurückbekommst; du kannst sie in deinen Pools in beliebiger Kombination hinzufügen, bis zu deinem normalen Maximum für jeden Pool.</w:t>
+          <w:b/>
+          <w:bCs/>
+          <w:lang w:val="de-DE"/>
+        </w:rPr>
+        <w:t>swurf</w:t>
+      </w:r>
+      <w:r>
+        <w:rPr>
+          <w:lang w:val="de-DE"/>
+        </w:rPr>
+        <w:t xml:space="preserve">. Die Erholung eines Kerncharakters entspricht einem 1W6-Wurf </w:t>
+      </w:r>
+      <w:proofErr w:type="gramStart"/>
+      <w:r>
+        <w:rPr>
+          <w:lang w:val="de-DE"/>
+        </w:rPr>
+        <w:t>plus seine</w:t>
+      </w:r>
+      <w:r>
+        <w:rPr>
+          <w:lang w:val="de-DE"/>
+        </w:rPr>
+        <w:t>m</w:t>
+      </w:r>
+      <w:r>
+        <w:rPr>
+          <w:lang w:val="de-DE"/>
+        </w:rPr>
+        <w:t xml:space="preserve"> </w:t>
+      </w:r>
+      <w:r>
+        <w:rPr>
+          <w:lang w:val="de-DE"/>
+        </w:rPr>
+        <w:t>Rang</w:t>
+      </w:r>
+      <w:proofErr w:type="gramEnd"/>
+      <w:r>
+        <w:rPr>
+          <w:lang w:val="de-DE"/>
+        </w:rPr>
+        <w:t>, also 1W6 + 1. Das Ergebnis des Wurfs ist, wie viele Punkte du zurückbekommst; du kannst sie in deinen Pools in beliebiger Kombination hinzufügen, bis zu deinem normalen Maximum für jeden Pool.</w:t>
       </w:r>
     </w:p>
     <w:p>
@@ -718,6 +2019,9 @@
       <w:bookmarkStart w:id="11" w:name="healing-wounds"/>
       <w:bookmarkEnd w:id="10"/>
       <w:r>
+        <w:rPr>
+          <w:highlight w:val="yellow"/>
+        </w:rPr>
         <w:t>Wunden heilen</w:t>
       </w:r>
     </w:p>
@@ -1750,7 +3054,6 @@
     <w:next w:val="Standard"/>
     <w:link w:val="berschrift2Zchn"/>
     <w:uiPriority w:val="9"/>
-    <w:semiHidden/>
     <w:unhideWhenUsed/>
     <w:qFormat/>
     <w:rsid w:val="00F366BF"/>
@@ -1966,7 +3269,6 @@
     <w:basedOn w:val="Absatz-Standardschriftart"/>
     <w:link w:val="berschrift2"/>
     <w:uiPriority w:val="9"/>
-    <w:semiHidden/>
     <w:rsid w:val="00F366BF"/>
     <w:rPr>
       <w:rFonts w:asciiTheme="majorHAnsi" w:eastAsiaTheme="majorEastAsia" w:hAnsiTheme="majorHAnsi" w:cstheme="majorBidi"/>

</xml_diff>